<commit_message>
Convert workorder exports to DOC with mobile-safe downloads
</commit_message>
<xml_diff>
--- a/templates/其他害虫工作单模板.docx
+++ b/templates/其他害虫工作单模板.docx
@@ -479,16 +479,6 @@
                 <w:lang w:val="en-US" w:eastAsia="zh-CN" w:bidi="ar-SA"/>
               </w:rPr>
             </w:pPr>
-            <w:r>
-              <w:rPr>
-                <w:rFonts w:hint="eastAsia" w:cs="Times New Roman"/>
-                <w:kern w:val="2"/>
-                <w:sz w:val="21"/>
-                <w:szCs w:val="22"/>
-                <w:lang w:val="en-US" w:eastAsia="zh-CN" w:bidi="ar-SA"/>
-              </w:rPr>
-              <w:t>李继广</w:t>
-            </w:r>
           </w:p>
         </w:tc>
         <w:tc>
@@ -534,16 +524,8 @@
                 <w:lang w:val="en-US" w:eastAsia="zh-CN" w:bidi="ar-SA"/>
               </w:rPr>
             </w:pPr>
-            <w:r>
-              <w:rPr>
-                <w:rFonts w:hint="eastAsia" w:cs="Times New Roman"/>
-                <w:kern w:val="2"/>
-                <w:sz w:val="21"/>
-                <w:szCs w:val="22"/>
-                <w:lang w:val="en-US" w:eastAsia="zh-CN" w:bidi="ar-SA"/>
-              </w:rPr>
-              <w:t>17319317196</w:t>
-            </w:r>
+            <w:bookmarkStart w:id="0" w:name="_GoBack"/>
+            <w:bookmarkEnd w:id="0"/>
           </w:p>
         </w:tc>
       </w:tr>
@@ -927,8 +909,6 @@
               </w:rPr>
               <w:t>{{plot_type}}</w:t>
             </w:r>
-            <w:bookmarkStart w:id="0" w:name="_GoBack"/>
-            <w:bookmarkEnd w:id="0"/>
           </w:p>
         </w:tc>
         <w:tc>

</xml_diff>